<commit_message>
feat(cad): rekaman layar Praktik Terbimbing Modul 13 (Housing Ringan Berlabel Jejak)
- Video tujuh langkah (2:10) dengan caption, backsound, identitas dosen, dan bab.
- Langkah 5: V_body dan co2 dipindah ke Spreadsheet kedua "Neraca". Di FreeCAD 1.1.4
  sel =Body.Shape.Volume di lembar Jejak (yang dibaca Thickness) melingkar: tampil
  #PENDING dan tidak ikut berubah saat sketsa diubah.
- Kartu "Alias dua arah" di Bagian 07 diganti "Dua lembar, satu arah"; Gambar 7,
  langkah 7, dan tabel gejala (#PENDING, rho tampil 0,00) diperbarui.

Co-Authored-By: Claude Opus 5.5 <noreply@anthropic.com>
</commit_message>
<xml_diff>
--- a/Pemodelan-Computer-Aided-Design/Modul-Word/Modul-13-Prinsip-Desain-Berkelanjutan-dalam-CAD.docx
+++ b/Pemodelan-Computer-Aided-Design/Modul-Word/Modul-13-Prinsip-Desain-Berkelanjutan-dalam-CAD.docx
@@ -10539,16 +10539,16 @@
           <w:i w:val="0"/>
           <w:sz w:val="22"/>
         </w:rPr>
-        <w:t xml:space="preserve">Alias dua arah: </w:t>
-      </w:r>
-      <w:r>
-        <w:rPr>
-          <w:rFonts w:ascii="Arial" w:hAnsi="Arial" w:eastAsia="Arial" w:cs="Arial"/>
-          <w:b w:val="0"/>
-          <w:i w:val="0"/>
-          <w:sz w:val="22"/>
-        </w:rPr>
-        <w:t xml:space="preserve">Sel beralias dapat dirujuk ekspresi properti model (=Jejak.t_dinding) dan sekaligus membaca model (=Body.Shape.Volume). Satu berkas berisi geometri sekaligus neraca jejaknya. </w:t>
+        <w:t xml:space="preserve">Dua lembar, satu arah: </w:t>
+      </w:r>
+      <w:r>
+        <w:rPr>
+          <w:rFonts w:ascii="Arial" w:hAnsi="Arial" w:eastAsia="Arial" w:cs="Arial"/>
+          <w:b w:val="0"/>
+          <w:i w:val="0"/>
+          <w:sz w:val="22"/>
+        </w:rPr>
+        <w:t xml:space="preserve">Lembar parameter (Jejak) dibaca model lewat ekspresi properti (=Jejak.t_dinding); lembar kedua (Neraca) membaca model (=Body.Shape.Volume). Bila satu lembar melakukan keduanya, dependensinya melingkar: sel tampil #PENDING dan tidak ikut berubah. </w:t>
       </w:r>
       <w:r>
         <w:rPr>
@@ -10557,26 +10557,7 @@
           <w:i/>
           <w:sz w:val="22"/>
         </w:rPr>
-        <w:t>=Jejak.co2</w:t>
-      </w:r>
-      <w:r>
-        <w:rPr>
-          <w:rFonts w:ascii="Arial" w:hAnsi="Arial" w:eastAsia="Arial" w:cs="Arial"/>
-          <w:b w:val="0"/>
-          <w:i/>
-          <w:sz w:val="22"/>
-          <w:vertAlign w:val="subscript"/>
-        </w:rPr>
-        <w:t>t</w:t>
-      </w:r>
-      <w:r>
-        <w:rPr>
-          <w:rFonts w:ascii="Arial" w:hAnsi="Arial" w:eastAsia="Arial" w:cs="Arial"/>
-          <w:b w:val="0"/>
-          <w:i/>
-          <w:sz w:val="22"/>
-        </w:rPr>
-        <w:t>otal</w:t>
+        <w:t>Jejak → Body → Neraca</w:t>
       </w:r>
     </w:p>
     <w:p>
@@ -12140,7 +12121,7 @@
           <w:i w:val="0"/>
           <w:sz w:val="22"/>
         </w:rPr>
-        <w:t>Tambahkan sel V_body = =Body.Shape.Volume dan co2 = =f_st * rho_st * V_body. Ubah satu dimensi sketsa dan pastikan angka jejak ikut berubah tanpa mengetik ulang apa pun.</w:t>
+        <w:t>Tambahkan Spreadsheet kedua bernama Neraca (bukan di Jejak, karena Jejak sudah dibaca Thickness) berisi V_body = =Body.Shape.Volume dan co2 = =Jejak.f_st * Jejak.rho_st * V_body. Ubah satu dimensi sketsa dan pastikan angka jejak ikut berubah tanpa mengetik ulang apa pun.</w:t>
       </w:r>
     </w:p>
     <w:p>
@@ -12206,7 +12187,7 @@
           <w:i w:val="0"/>
           <w:sz w:val="22"/>
         </w:rPr>
-        <w:t>Tulis kesimpulan satu paragraf pada sel catatan Spreadsheet: alternatif terpilih, penghematan massa, penghematan jejak, dan batas yang dijaga. Ctrl+S → Latihan13_NIM.FCStd.</w:t>
+        <w:t>Tulis kesimpulan satu paragraf pada sel catatan Spreadsheet Neraca: alternatif terpilih, penghematan massa, penghematan jejak, dan batas yang dijaga. Ctrl+S → Latihan13_NIM.FCStd.</w:t>
       </w:r>
     </w:p>
     <w:p>
@@ -12531,6 +12512,124 @@
                 <w:sz w:val="18"/>
               </w:rPr>
               <w:t>Ganti menjadi ekspresi; recompute dokumen (F5)</w:t>
+            </w:r>
+          </w:p>
+        </w:tc>
+      </w:tr>
+      <w:tr>
+        <w:tc>
+          <w:tcPr>
+            <w:tcW w:type="dxa" w:w="2929"/>
+          </w:tcPr>
+          <w:p>
+            <w:pPr>
+              <w:spacing w:after="0"/>
+            </w:pPr>
+            <w:r>
+              <w:rPr>
+                <w:rFonts w:ascii="Arial" w:hAnsi="Arial" w:eastAsia="Arial" w:cs="Arial"/>
+                <w:b w:val="0"/>
+                <w:i w:val="0"/>
+                <w:sz w:val="18"/>
+              </w:rPr>
+              <w:t>Sel V_body tampil #PENDING dan jejak tidak ikut berubah</w:t>
+            </w:r>
+          </w:p>
+        </w:tc>
+        <w:tc>
+          <w:tcPr>
+            <w:tcW w:type="dxa" w:w="2929"/>
+          </w:tcPr>
+          <w:p>
+            <w:pPr>
+              <w:spacing w:after="0"/>
+            </w:pPr>
+            <w:r>
+              <w:rPr>
+                <w:rFonts w:ascii="Arial" w:hAnsi="Arial" w:eastAsia="Arial" w:cs="Arial"/>
+                <w:b w:val="0"/>
+                <w:i w:val="0"/>
+                <w:sz w:val="18"/>
+              </w:rPr>
+              <w:t>V_body ditulis di Jejak, padahal Jejak sudah dibaca Thickness: dependensi melingkar</w:t>
+            </w:r>
+          </w:p>
+        </w:tc>
+        <w:tc>
+          <w:tcPr>
+            <w:tcW w:type="dxa" w:w="2929"/>
+          </w:tcPr>
+          <w:p>
+            <w:pPr>
+              <w:spacing w:after="0"/>
+            </w:pPr>
+            <w:r>
+              <w:rPr>
+                <w:rFonts w:ascii="Arial" w:hAnsi="Arial" w:eastAsia="Arial" w:cs="Arial"/>
+                <w:b w:val="0"/>
+                <w:i w:val="0"/>
+                <w:sz w:val="18"/>
+              </w:rPr>
+              <w:t>Pindahkan V_body dan co2 ke lembar kedua Neraca</w:t>
+            </w:r>
+          </w:p>
+        </w:tc>
+      </w:tr>
+      <w:tr>
+        <w:tc>
+          <w:tcPr>
+            <w:tcW w:type="dxa" w:w="2929"/>
+          </w:tcPr>
+          <w:p>
+            <w:pPr>
+              <w:spacing w:after="0"/>
+            </w:pPr>
+            <w:r>
+              <w:rPr>
+                <w:rFonts w:ascii="Arial" w:hAnsi="Arial" w:eastAsia="Arial" w:cs="Arial"/>
+                <w:b w:val="0"/>
+                <w:i w:val="0"/>
+                <w:sz w:val="18"/>
+              </w:rPr>
+              <w:t>rho_st tampil 0,00</w:t>
+            </w:r>
+          </w:p>
+        </w:tc>
+        <w:tc>
+          <w:tcPr>
+            <w:tcW w:type="dxa" w:w="2929"/>
+          </w:tcPr>
+          <w:p>
+            <w:pPr>
+              <w:spacing w:after="0"/>
+            </w:pPr>
+            <w:r>
+              <w:rPr>
+                <w:rFonts w:ascii="Arial" w:hAnsi="Arial" w:eastAsia="Arial" w:cs="Arial"/>
+                <w:b w:val="0"/>
+                <w:i w:val="0"/>
+                <w:sz w:val="18"/>
+              </w:rPr>
+              <w:t>Spreadsheet membulatkan tampilan ke dua desimal</w:t>
+            </w:r>
+          </w:p>
+        </w:tc>
+        <w:tc>
+          <w:tcPr>
+            <w:tcW w:type="dxa" w:w="2929"/>
+          </w:tcPr>
+          <w:p>
+            <w:pPr>
+              <w:spacing w:after="0"/>
+            </w:pPr>
+            <w:r>
+              <w:rPr>
+                <w:rFonts w:ascii="Arial" w:hAnsi="Arial" w:eastAsia="Arial" w:cs="Arial"/>
+                <w:b w:val="0"/>
+                <w:i w:val="0"/>
+                <w:sz w:val="18"/>
+              </w:rPr>
+              <w:t>Nilai tetap 7,85e-6; lihat kolom Content saat sel dipilih</w:t>
             </w:r>
           </w:p>
         </w:tc>

</xml_diff>

<commit_message>
feat(cad): rekaman layar Praktik Terbimbing Modul 13 (Housing Ringan Berlabel Jejak) (#1033)
- Video tujuh langkah (2:10) dengan caption, backsound, identitas dosen, dan bab.
- Langkah 5: V_body dan co2 dipindah ke Spreadsheet kedua "Neraca". Di FreeCAD 1.1.4
  sel =Body.Shape.Volume di lembar Jejak (yang dibaca Thickness) melingkar: tampil
  #PENDING dan tidak ikut berubah saat sketsa diubah.
- Kartu "Alias dua arah" di Bagian 07 diganti "Dua lembar, satu arah"; Gambar 7,
  langkah 7, dan tabel gejala (#PENDING, rho tampil 0,00) diperbarui.

Co-authored-by: Claude Opus 5.5 <noreply@anthropic.com>
</commit_message>
<xml_diff>
--- a/Pemodelan-Computer-Aided-Design/Modul-Word/Modul-13-Prinsip-Desain-Berkelanjutan-dalam-CAD.docx
+++ b/Pemodelan-Computer-Aided-Design/Modul-Word/Modul-13-Prinsip-Desain-Berkelanjutan-dalam-CAD.docx
@@ -10539,16 +10539,16 @@
           <w:i w:val="0"/>
           <w:sz w:val="22"/>
         </w:rPr>
-        <w:t xml:space="preserve">Alias dua arah: </w:t>
-      </w:r>
-      <w:r>
-        <w:rPr>
-          <w:rFonts w:ascii="Arial" w:hAnsi="Arial" w:eastAsia="Arial" w:cs="Arial"/>
-          <w:b w:val="0"/>
-          <w:i w:val="0"/>
-          <w:sz w:val="22"/>
-        </w:rPr>
-        <w:t xml:space="preserve">Sel beralias dapat dirujuk ekspresi properti model (=Jejak.t_dinding) dan sekaligus membaca model (=Body.Shape.Volume). Satu berkas berisi geometri sekaligus neraca jejaknya. </w:t>
+        <w:t xml:space="preserve">Dua lembar, satu arah: </w:t>
+      </w:r>
+      <w:r>
+        <w:rPr>
+          <w:rFonts w:ascii="Arial" w:hAnsi="Arial" w:eastAsia="Arial" w:cs="Arial"/>
+          <w:b w:val="0"/>
+          <w:i w:val="0"/>
+          <w:sz w:val="22"/>
+        </w:rPr>
+        <w:t xml:space="preserve">Lembar parameter (Jejak) dibaca model lewat ekspresi properti (=Jejak.t_dinding); lembar kedua (Neraca) membaca model (=Body.Shape.Volume). Bila satu lembar melakukan keduanya, dependensinya melingkar: sel tampil #PENDING dan tidak ikut berubah. </w:t>
       </w:r>
       <w:r>
         <w:rPr>
@@ -10557,26 +10557,7 @@
           <w:i/>
           <w:sz w:val="22"/>
         </w:rPr>
-        <w:t>=Jejak.co2</w:t>
-      </w:r>
-      <w:r>
-        <w:rPr>
-          <w:rFonts w:ascii="Arial" w:hAnsi="Arial" w:eastAsia="Arial" w:cs="Arial"/>
-          <w:b w:val="0"/>
-          <w:i/>
-          <w:sz w:val="22"/>
-          <w:vertAlign w:val="subscript"/>
-        </w:rPr>
-        <w:t>t</w:t>
-      </w:r>
-      <w:r>
-        <w:rPr>
-          <w:rFonts w:ascii="Arial" w:hAnsi="Arial" w:eastAsia="Arial" w:cs="Arial"/>
-          <w:b w:val="0"/>
-          <w:i/>
-          <w:sz w:val="22"/>
-        </w:rPr>
-        <w:t>otal</w:t>
+        <w:t>Jejak → Body → Neraca</w:t>
       </w:r>
     </w:p>
     <w:p>
@@ -12140,7 +12121,7 @@
           <w:i w:val="0"/>
           <w:sz w:val="22"/>
         </w:rPr>
-        <w:t>Tambahkan sel V_body = =Body.Shape.Volume dan co2 = =f_st * rho_st * V_body. Ubah satu dimensi sketsa dan pastikan angka jejak ikut berubah tanpa mengetik ulang apa pun.</w:t>
+        <w:t>Tambahkan Spreadsheet kedua bernama Neraca (bukan di Jejak, karena Jejak sudah dibaca Thickness) berisi V_body = =Body.Shape.Volume dan co2 = =Jejak.f_st * Jejak.rho_st * V_body. Ubah satu dimensi sketsa dan pastikan angka jejak ikut berubah tanpa mengetik ulang apa pun.</w:t>
       </w:r>
     </w:p>
     <w:p>
@@ -12206,7 +12187,7 @@
           <w:i w:val="0"/>
           <w:sz w:val="22"/>
         </w:rPr>
-        <w:t>Tulis kesimpulan satu paragraf pada sel catatan Spreadsheet: alternatif terpilih, penghematan massa, penghematan jejak, dan batas yang dijaga. Ctrl+S → Latihan13_NIM.FCStd.</w:t>
+        <w:t>Tulis kesimpulan satu paragraf pada sel catatan Spreadsheet Neraca: alternatif terpilih, penghematan massa, penghematan jejak, dan batas yang dijaga. Ctrl+S → Latihan13_NIM.FCStd.</w:t>
       </w:r>
     </w:p>
     <w:p>
@@ -12531,6 +12512,124 @@
                 <w:sz w:val="18"/>
               </w:rPr>
               <w:t>Ganti menjadi ekspresi; recompute dokumen (F5)</w:t>
+            </w:r>
+          </w:p>
+        </w:tc>
+      </w:tr>
+      <w:tr>
+        <w:tc>
+          <w:tcPr>
+            <w:tcW w:type="dxa" w:w="2929"/>
+          </w:tcPr>
+          <w:p>
+            <w:pPr>
+              <w:spacing w:after="0"/>
+            </w:pPr>
+            <w:r>
+              <w:rPr>
+                <w:rFonts w:ascii="Arial" w:hAnsi="Arial" w:eastAsia="Arial" w:cs="Arial"/>
+                <w:b w:val="0"/>
+                <w:i w:val="0"/>
+                <w:sz w:val="18"/>
+              </w:rPr>
+              <w:t>Sel V_body tampil #PENDING dan jejak tidak ikut berubah</w:t>
+            </w:r>
+          </w:p>
+        </w:tc>
+        <w:tc>
+          <w:tcPr>
+            <w:tcW w:type="dxa" w:w="2929"/>
+          </w:tcPr>
+          <w:p>
+            <w:pPr>
+              <w:spacing w:after="0"/>
+            </w:pPr>
+            <w:r>
+              <w:rPr>
+                <w:rFonts w:ascii="Arial" w:hAnsi="Arial" w:eastAsia="Arial" w:cs="Arial"/>
+                <w:b w:val="0"/>
+                <w:i w:val="0"/>
+                <w:sz w:val="18"/>
+              </w:rPr>
+              <w:t>V_body ditulis di Jejak, padahal Jejak sudah dibaca Thickness: dependensi melingkar</w:t>
+            </w:r>
+          </w:p>
+        </w:tc>
+        <w:tc>
+          <w:tcPr>
+            <w:tcW w:type="dxa" w:w="2929"/>
+          </w:tcPr>
+          <w:p>
+            <w:pPr>
+              <w:spacing w:after="0"/>
+            </w:pPr>
+            <w:r>
+              <w:rPr>
+                <w:rFonts w:ascii="Arial" w:hAnsi="Arial" w:eastAsia="Arial" w:cs="Arial"/>
+                <w:b w:val="0"/>
+                <w:i w:val="0"/>
+                <w:sz w:val="18"/>
+              </w:rPr>
+              <w:t>Pindahkan V_body dan co2 ke lembar kedua Neraca</w:t>
+            </w:r>
+          </w:p>
+        </w:tc>
+      </w:tr>
+      <w:tr>
+        <w:tc>
+          <w:tcPr>
+            <w:tcW w:type="dxa" w:w="2929"/>
+          </w:tcPr>
+          <w:p>
+            <w:pPr>
+              <w:spacing w:after="0"/>
+            </w:pPr>
+            <w:r>
+              <w:rPr>
+                <w:rFonts w:ascii="Arial" w:hAnsi="Arial" w:eastAsia="Arial" w:cs="Arial"/>
+                <w:b w:val="0"/>
+                <w:i w:val="0"/>
+                <w:sz w:val="18"/>
+              </w:rPr>
+              <w:t>rho_st tampil 0,00</w:t>
+            </w:r>
+          </w:p>
+        </w:tc>
+        <w:tc>
+          <w:tcPr>
+            <w:tcW w:type="dxa" w:w="2929"/>
+          </w:tcPr>
+          <w:p>
+            <w:pPr>
+              <w:spacing w:after="0"/>
+            </w:pPr>
+            <w:r>
+              <w:rPr>
+                <w:rFonts w:ascii="Arial" w:hAnsi="Arial" w:eastAsia="Arial" w:cs="Arial"/>
+                <w:b w:val="0"/>
+                <w:i w:val="0"/>
+                <w:sz w:val="18"/>
+              </w:rPr>
+              <w:t>Spreadsheet membulatkan tampilan ke dua desimal</w:t>
+            </w:r>
+          </w:p>
+        </w:tc>
+        <w:tc>
+          <w:tcPr>
+            <w:tcW w:type="dxa" w:w="2929"/>
+          </w:tcPr>
+          <w:p>
+            <w:pPr>
+              <w:spacing w:after="0"/>
+            </w:pPr>
+            <w:r>
+              <w:rPr>
+                <w:rFonts w:ascii="Arial" w:hAnsi="Arial" w:eastAsia="Arial" w:cs="Arial"/>
+                <w:b w:val="0"/>
+                <w:i w:val="0"/>
+                <w:sz w:val="18"/>
+              </w:rPr>
+              <w:t>Nilai tetap 7,85e-6; lihat kolom Content saat sel dipilih</w:t>
             </w:r>
           </w:p>
         </w:tc>

</xml_diff>

<commit_message>
feat(cad): video Modul 13 versi klik GUI + teks praktik sesuai rekaman
Video praktik terbimbing Modul 13 (housing ringan berlabel jejak, 10:54) direkam
dengan klik GUI asli: Pad 160 × 120 × 80, Spreadsheet Jejak (rho_st, f_st, t_dinding
beralias), massa pejal 12.057,6 g, Thickness Skin ke dalam diikat =Jejak.t_dinding
(298.500 mm³, 2.343,2 g, hemat 80,6 %), sapuan t 8–3 mm lewat sel + Refresh + panggil
ulang konsol, Spreadsheet Neraca (V_body, co2 = 4,69 kg; Pad 90 → 5,11 kg tanpa
mengetik ulang), alternatif aluminium t_al 7,21 mm (1,13 kg, 13,52 kg CO₂), catatan di
sel gabungan, Ctrl+S.

Teks Bagian 09 Modul 13 mengikuti rekaman (nilai sel, Expression Editor, Refresh,
Ctrl+End + panah atas di konsol, Pad Length 90 sebagai dimensi yang diubah, Merge Cells);
tabel gejala bertambah tiga baris; catatan Gambar 7 menyebut t_al = 7,21. Word/PDF
Modul 13 dan PDF gabungan CAD dibangun ulang.

Co-Authored-By: Claude Opus 5.5 <noreply@anthropic.com>
</commit_message>
<xml_diff>
--- a/Pemodelan-Computer-Aided-Design/Modul-Word/Modul-13-Prinsip-Desain-Berkelanjutan-dalam-CAD.docx
+++ b/Pemodelan-Computer-Aided-Design/Modul-Word/Modul-13-Prinsip-Desain-Berkelanjutan-dalam-CAD.docx
@@ -11989,7 +11989,25 @@
           <w:i w:val="0"/>
           <w:sz w:val="22"/>
         </w:rPr>
-        <w:t>Buat Body: Sketch XY persegi panjang 160 × 120 (sudut kiri-bawah di titik asal, fully constrained) → Pad 80 mm. Tambahkan Spreadsheet bernama Jejak, isi alias rho_st, f_st, t_dinding = 5.</w:t>
+        <w:t xml:space="preserve">Part Design → New Body; Sketch → New Sketch → XY-plane; Rectangle dengan </w:t>
+      </w:r>
+      <w:r>
+        <w:rPr>
+          <w:rFonts w:ascii="Arial" w:hAnsi="Arial" w:eastAsia="Arial" w:cs="Arial"/>
+          <w:b w:val="0"/>
+          <w:i/>
+          <w:sz w:val="22"/>
+        </w:rPr>
+        <w:t>on-view parameters</w:t>
+      </w:r>
+      <w:r>
+        <w:rPr>
+          <w:rFonts w:ascii="Arial" w:hAnsi="Arial" w:eastAsia="Arial" w:cs="Arial"/>
+          <w:b w:val="0"/>
+          <w:i w:val="0"/>
+          <w:sz w:val="22"/>
+        </w:rPr>
+        <w:t>: sudut 0, 0 lalu 160 × 120 (fully constrained) → Close → Pad 80. Workbench Spreadsheet → New Spreadsheet, F2 ganti nama Jejak, klik ganda: kolom A rho_st, f_st, t_dinding; kolom B 7.85e-6 (kg/mm³; sel memakai titik desimal), 2, 5; beri alias rho_st, f_st, t_dinding pada kotak Alias.</w:t>
       </w:r>
     </w:p>
     <w:p>
@@ -12022,7 +12040,7 @@
           <w:i w:val="0"/>
           <w:sz w:val="22"/>
         </w:rPr>
-        <w:t>Di Python console: Body.Shape.Volume lalu massa = 7,85 × 10⁻³ × V. Catat sebagai baris pertama tabel iterasi (12.058 g untuk ukuran contoh). Tanpa garis dasar, penghematan tidak dapat diklaim.</w:t>
+        <w:t>Tab 3D, Python console: App.ActiveDocument.Body.Shape.Volume = 1.536.000 mm³, lalu round(7.85e-3 * App.ActiveDocument.Body.Shape.Volume, 1) = 12.057,6 g. Catat sebagai baris pertama tabel iterasi. Tanpa garis dasar, penghematan tidak dapat diklaim.</w:t>
       </w:r>
     </w:p>
     <w:p>
@@ -12055,7 +12073,43 @@
           <w:i w:val="0"/>
           <w:sz w:val="22"/>
         </w:rPr>
-        <w:t>Pilih muka ATAS → Part Design → Thickness, Thickness diikat ekspresi =Jejak.t_dinding, Mode Skin, arah ke dalam. Baca volume dan massa baru; bandingkan dengan Persamaan (5).</w:t>
+        <w:t xml:space="preserve">Klik muka ATAS → Part Design → Dress-Up Features → </w:t>
+      </w:r>
+      <w:r>
+        <w:rPr>
+          <w:rFonts w:ascii="Arial" w:hAnsi="Arial" w:eastAsia="Arial" w:cs="Arial"/>
+          <w:b/>
+          <w:i w:val="0"/>
+          <w:sz w:val="22"/>
+        </w:rPr>
+        <w:t>Thickness</w:t>
+      </w:r>
+      <w:r>
+        <w:rPr>
+          <w:rFonts w:ascii="Arial" w:hAnsi="Arial" w:eastAsia="Arial" w:cs="Arial"/>
+          <w:b w:val="0"/>
+          <w:i w:val="0"/>
+          <w:sz w:val="22"/>
+        </w:rPr>
+        <w:t xml:space="preserve">. Pada kotak Thickness ketik = lalu Jejak.t_dinding (Expression Editor); Mode Skin dan </w:t>
+      </w:r>
+      <w:r>
+        <w:rPr>
+          <w:rFonts w:ascii="Arial" w:hAnsi="Arial" w:eastAsia="Arial" w:cs="Arial"/>
+          <w:b w:val="0"/>
+          <w:i/>
+          <w:sz w:val="22"/>
+        </w:rPr>
+        <w:t>Make thickness inwards</w:t>
+      </w:r>
+      <w:r>
+        <w:rPr>
+          <w:rFonts w:ascii="Arial" w:hAnsi="Arial" w:eastAsia="Arial" w:cs="Arial"/>
+          <w:b w:val="0"/>
+          <w:i w:val="0"/>
+          <w:sz w:val="22"/>
+        </w:rPr>
+        <w:t xml:space="preserve"> tercentang → OK. Konsol: volume 298.500 mm³, massa 2.343,2 g, hemat 80,6 %; bandingkan dengan Persamaan (5).</w:t>
       </w:r>
     </w:p>
     <w:p>
@@ -12088,7 +12142,7 @@
           <w:i w:val="0"/>
           <w:sz w:val="22"/>
         </w:rPr>
-        <w:t>Ubah t_dinding menjadi 8, 6, 5, 4, lalu 3 mm dan catat massanya tiap kali. Perhatikan kapan penghematan mulai melandai dan kapan Thickness mulai gagal.</w:t>
+        <w:t>Tab Jejak: B3 = 8 → Refresh (Ctrl+R) → di konsol klik, Ctrl+End, panah atas, Enter (perintah massa dipanggil ulang). Ulangi untuk 6, 5, 4, 3 mm: massa 3.593,2 · 2.772,5 · 2.343,2 · 1.901,1 · 1.445,9 g, lalu kembalikan ke 5. Perhatikan kapan penghematan mulai melandai dan kapan Thickness mulai gagal.</w:t>
       </w:r>
     </w:p>
     <w:p>
@@ -12121,7 +12175,7 @@
           <w:i w:val="0"/>
           <w:sz w:val="22"/>
         </w:rPr>
-        <w:t>Tambahkan Spreadsheet kedua bernama Neraca (bukan di Jejak, karena Jejak sudah dibaca Thickness) berisi V_body = =Body.Shape.Volume dan co2 = =Jejak.f_st * Jejak.rho_st * V_body. Ubah satu dimensi sketsa dan pastikan angka jejak ikut berubah tanpa mengetik ulang apa pun.</w:t>
+        <w:t>Spreadsheet kedua Neraca (bukan di Jejak, karena Jejak sudah dibaca Thickness): A1 V_body, B1 =Body.Shape.Volume (alias V_body); A2 co2, B2 =Jejak.f_st * Jejak.rho_st * V_body (alias co2) = 298.500 mm³ dan 4,69 kg CO₂. Ubah satu dimensi: pilih Pad → Data → Length 90 → Refresh: Neraca menjadi 325.500 mm³ dan 5,11 kg tanpa mengetik ulang; kembalikan ke 80.</w:t>
       </w:r>
     </w:p>
     <w:p>
@@ -12154,7 +12208,26 @@
           <w:i w:val="0"/>
           <w:sz w:val="22"/>
         </w:rPr>
-        <w:t>Duplikat baris tabel untuk aluminium: tinggi penampang disesuaikan agar kekakuan sama (Persamaan 2), ρ dan f diganti. Bandingkan massa dan jejaknya — perhatikan bahwa massa turun tetapi jejak dapat naik.</w:t>
+        <w:t>Jejak: rho_al 2.7e-6, f_al 12, t_al =t_dinding * (210000 / 70000) ^ (1 / 3) = 7,21 mm (kekakuan dinding sama, Persamaan 2), beri alias. Neraca: m_st =Jejak.rho_st * V_body = 2,34 kg; m_al = ρ</w:t>
+      </w:r>
+      <w:r>
+        <w:rPr>
+          <w:rFonts w:ascii="Arial" w:hAnsi="Arial" w:eastAsia="Arial" w:cs="Arial"/>
+          <w:b w:val="0"/>
+          <w:i w:val="0"/>
+          <w:sz w:val="22"/>
+          <w:vertAlign w:val="subscript"/>
+        </w:rPr>
+        <w:t>al</w:t>
+      </w:r>
+      <w:r>
+        <w:rPr>
+          <w:rFonts w:ascii="Arial" w:hAnsi="Arial" w:eastAsia="Arial" w:cs="Arial"/>
+          <w:b w:val="0"/>
+          <w:i w:val="0"/>
+          <w:sz w:val="22"/>
+        </w:rPr>
+        <w:t xml:space="preserve"> × volume cangkang setebal t_al = 1,13 kg; co2_al =Jejak.f_al * m_al = 13,52 kg CO₂. Massa turun 52 %, tetapi jejak naik 188 %.</w:t>
       </w:r>
     </w:p>
     <w:p>
@@ -12187,7 +12260,7 @@
           <w:i w:val="0"/>
           <w:sz w:val="22"/>
         </w:rPr>
-        <w:t>Tulis kesimpulan satu paragraf pada sel catatan Spreadsheet Neraca: alternatif terpilih, penghematan massa, penghematan jejak, dan batas yang dijaga. Ctrl+S → Latihan13_NIM.FCStd.</w:t>
+        <w:t>Neraca: klik A7, Shift+klik H7 → Spreadsheet → Merge Cells (teks sel tidak meluap ke sel sebelah), lalu tulis kesimpulan: alternatif terpilih, penghematan massa, jejak, dan batas yang dijaga. Tab 3D, Ctrl+S → Latihan13_NIM.FCStd.</w:t>
       </w:r>
     </w:p>
     <w:p>
@@ -12276,6 +12349,183 @@
                 <w:sz w:val="18"/>
               </w:rPr>
               <w:t>Perbaikan</w:t>
+            </w:r>
+          </w:p>
+        </w:tc>
+      </w:tr>
+      <w:tr>
+        <w:tc>
+          <w:tcPr>
+            <w:tcW w:type="dxa" w:w="2929"/>
+          </w:tcPr>
+          <w:p>
+            <w:pPr>
+              <w:spacing w:after="0"/>
+            </w:pPr>
+            <w:r>
+              <w:rPr>
+                <w:rFonts w:ascii="Arial" w:hAnsi="Arial" w:eastAsia="Arial" w:cs="Arial"/>
+                <w:b w:val="0"/>
+                <w:i w:val="0"/>
+                <w:sz w:val="18"/>
+              </w:rPr>
+              <w:t>Massa di konsol tidak berubah setelah t_dinding diubah</w:t>
+            </w:r>
+          </w:p>
+        </w:tc>
+        <w:tc>
+          <w:tcPr>
+            <w:tcW w:type="dxa" w:w="2929"/>
+          </w:tcPr>
+          <w:p>
+            <w:pPr>
+              <w:spacing w:after="0"/>
+            </w:pPr>
+            <w:r>
+              <w:rPr>
+                <w:rFonts w:ascii="Arial" w:hAnsi="Arial" w:eastAsia="Arial" w:cs="Arial"/>
+                <w:b w:val="0"/>
+                <w:i w:val="0"/>
+                <w:sz w:val="18"/>
+              </w:rPr>
+              <w:t>Dokumen belum di-recompute setelah sel diganti</w:t>
+            </w:r>
+          </w:p>
+        </w:tc>
+        <w:tc>
+          <w:tcPr>
+            <w:tcW w:type="dxa" w:w="2929"/>
+          </w:tcPr>
+          <w:p>
+            <w:pPr>
+              <w:spacing w:after="0"/>
+            </w:pPr>
+            <w:r>
+              <w:rPr>
+                <w:rFonts w:ascii="Arial" w:hAnsi="Arial" w:eastAsia="Arial" w:cs="Arial"/>
+                <w:b w:val="0"/>
+                <w:i w:val="0"/>
+                <w:sz w:val="18"/>
+              </w:rPr>
+              <w:t>Klik Refresh (Ctrl+R), lalu baca ulang massa</w:t>
+            </w:r>
+          </w:p>
+        </w:tc>
+      </w:tr>
+      <w:tr>
+        <w:tc>
+          <w:tcPr>
+            <w:tcW w:type="dxa" w:w="2929"/>
+          </w:tcPr>
+          <w:p>
+            <w:pPr>
+              <w:spacing w:after="0"/>
+            </w:pPr>
+            <w:r>
+              <w:rPr>
+                <w:rFonts w:ascii="Arial" w:hAnsi="Arial" w:eastAsia="Arial" w:cs="Arial"/>
+                <w:b w:val="0"/>
+                <w:i w:val="0"/>
+                <w:sz w:val="18"/>
+              </w:rPr>
+              <w:t>Panah atas di konsol tidak memanggil perintah sebelumnya</w:t>
+            </w:r>
+          </w:p>
+        </w:tc>
+        <w:tc>
+          <w:tcPr>
+            <w:tcW w:type="dxa" w:w="2929"/>
+          </w:tcPr>
+          <w:p>
+            <w:pPr>
+              <w:spacing w:after="0"/>
+            </w:pPr>
+            <w:r>
+              <w:rPr>
+                <w:rFonts w:ascii="Arial" w:hAnsi="Arial" w:eastAsia="Arial" w:cs="Arial"/>
+                <w:b w:val="0"/>
+                <w:i w:val="0"/>
+                <w:sz w:val="18"/>
+              </w:rPr>
+              <w:t>Kursor berada di area keluaran konsol, bukan di baris prompt</w:t>
+            </w:r>
+          </w:p>
+        </w:tc>
+        <w:tc>
+          <w:tcPr>
+            <w:tcW w:type="dxa" w:w="2929"/>
+          </w:tcPr>
+          <w:p>
+            <w:pPr>
+              <w:spacing w:after="0"/>
+            </w:pPr>
+            <w:r>
+              <w:rPr>
+                <w:rFonts w:ascii="Arial" w:hAnsi="Arial" w:eastAsia="Arial" w:cs="Arial"/>
+                <w:b w:val="0"/>
+                <w:i w:val="0"/>
+                <w:sz w:val="18"/>
+              </w:rPr>
+              <w:t>Klik konsol, Ctrl+End, lalu panah atas</w:t>
+            </w:r>
+          </w:p>
+        </w:tc>
+      </w:tr>
+      <w:tr>
+        <w:tc>
+          <w:tcPr>
+            <w:tcW w:type="dxa" w:w="2929"/>
+          </w:tcPr>
+          <w:p>
+            <w:pPr>
+              <w:spacing w:after="0"/>
+            </w:pPr>
+            <w:r>
+              <w:rPr>
+                <w:rFonts w:ascii="Arial" w:hAnsi="Arial" w:eastAsia="Arial" w:cs="Arial"/>
+                <w:b w:val="0"/>
+                <w:i w:val="0"/>
+                <w:sz w:val="18"/>
+              </w:rPr>
+              <w:t>Catatan di sel terpotong menjadi “Terpilih: …”</w:t>
+            </w:r>
+          </w:p>
+        </w:tc>
+        <w:tc>
+          <w:tcPr>
+            <w:tcW w:type="dxa" w:w="2929"/>
+          </w:tcPr>
+          <w:p>
+            <w:pPr>
+              <w:spacing w:after="0"/>
+            </w:pPr>
+            <w:r>
+              <w:rPr>
+                <w:rFonts w:ascii="Arial" w:hAnsi="Arial" w:eastAsia="Arial" w:cs="Arial"/>
+                <w:b w:val="0"/>
+                <w:i w:val="0"/>
+                <w:sz w:val="18"/>
+              </w:rPr>
+              <w:t>Teks sel Spreadsheet tidak meluap ke sel sebelah</w:t>
+            </w:r>
+          </w:p>
+        </w:tc>
+        <w:tc>
+          <w:tcPr>
+            <w:tcW w:type="dxa" w:w="2929"/>
+          </w:tcPr>
+          <w:p>
+            <w:pPr>
+              <w:spacing w:after="0"/>
+            </w:pPr>
+            <w:r>
+              <w:rPr>
+                <w:rFonts w:ascii="Arial" w:hAnsi="Arial" w:eastAsia="Arial" w:cs="Arial"/>
+                <w:b w:val="0"/>
+                <w:i w:val="0"/>
+                <w:sz w:val="18"/>
+              </w:rPr>
+              <w:t>Gabungkan sel (Spreadsheet → Merge Cells) sebelum mengetik</w:t>
             </w:r>
           </w:p>
         </w:tc>

</xml_diff>

<commit_message>
feat(cad): video Modul 13 versi klik GUI + teks praktik sesuai rekaman (#1052)
Video praktik terbimbing Modul 13 (housing ringan berlabel jejak, 10:54) direkam
dengan klik GUI asli: Pad 160 × 120 × 80, Spreadsheet Jejak (rho_st, f_st, t_dinding
beralias), massa pejal 12.057,6 g, Thickness Skin ke dalam diikat =Jejak.t_dinding
(298.500 mm³, 2.343,2 g, hemat 80,6 %), sapuan t 8–3 mm lewat sel + Refresh + panggil
ulang konsol, Spreadsheet Neraca (V_body, co2 = 4,69 kg; Pad 90 → 5,11 kg tanpa
mengetik ulang), alternatif aluminium t_al 7,21 mm (1,13 kg, 13,52 kg CO₂), catatan di
sel gabungan, Ctrl+S.

Teks Bagian 09 Modul 13 mengikuti rekaman (nilai sel, Expression Editor, Refresh,
Ctrl+End + panah atas di konsol, Pad Length 90 sebagai dimensi yang diubah, Merge Cells);
tabel gejala bertambah tiga baris; catatan Gambar 7 menyebut t_al = 7,21. Word/PDF
Modul 13 dan PDF gabungan CAD dibangun ulang.

Co-authored-by: Claude Opus 5.5 <noreply@anthropic.com>
</commit_message>
<xml_diff>
--- a/Pemodelan-Computer-Aided-Design/Modul-Word/Modul-13-Prinsip-Desain-Berkelanjutan-dalam-CAD.docx
+++ b/Pemodelan-Computer-Aided-Design/Modul-Word/Modul-13-Prinsip-Desain-Berkelanjutan-dalam-CAD.docx
@@ -11989,7 +11989,25 @@
           <w:i w:val="0"/>
           <w:sz w:val="22"/>
         </w:rPr>
-        <w:t>Buat Body: Sketch XY persegi panjang 160 × 120 (sudut kiri-bawah di titik asal, fully constrained) → Pad 80 mm. Tambahkan Spreadsheet bernama Jejak, isi alias rho_st, f_st, t_dinding = 5.</w:t>
+        <w:t xml:space="preserve">Part Design → New Body; Sketch → New Sketch → XY-plane; Rectangle dengan </w:t>
+      </w:r>
+      <w:r>
+        <w:rPr>
+          <w:rFonts w:ascii="Arial" w:hAnsi="Arial" w:eastAsia="Arial" w:cs="Arial"/>
+          <w:b w:val="0"/>
+          <w:i/>
+          <w:sz w:val="22"/>
+        </w:rPr>
+        <w:t>on-view parameters</w:t>
+      </w:r>
+      <w:r>
+        <w:rPr>
+          <w:rFonts w:ascii="Arial" w:hAnsi="Arial" w:eastAsia="Arial" w:cs="Arial"/>
+          <w:b w:val="0"/>
+          <w:i w:val="0"/>
+          <w:sz w:val="22"/>
+        </w:rPr>
+        <w:t>: sudut 0, 0 lalu 160 × 120 (fully constrained) → Close → Pad 80. Workbench Spreadsheet → New Spreadsheet, F2 ganti nama Jejak, klik ganda: kolom A rho_st, f_st, t_dinding; kolom B 7.85e-6 (kg/mm³; sel memakai titik desimal), 2, 5; beri alias rho_st, f_st, t_dinding pada kotak Alias.</w:t>
       </w:r>
     </w:p>
     <w:p>
@@ -12022,7 +12040,7 @@
           <w:i w:val="0"/>
           <w:sz w:val="22"/>
         </w:rPr>
-        <w:t>Di Python console: Body.Shape.Volume lalu massa = 7,85 × 10⁻³ × V. Catat sebagai baris pertama tabel iterasi (12.058 g untuk ukuran contoh). Tanpa garis dasar, penghematan tidak dapat diklaim.</w:t>
+        <w:t>Tab 3D, Python console: App.ActiveDocument.Body.Shape.Volume = 1.536.000 mm³, lalu round(7.85e-3 * App.ActiveDocument.Body.Shape.Volume, 1) = 12.057,6 g. Catat sebagai baris pertama tabel iterasi. Tanpa garis dasar, penghematan tidak dapat diklaim.</w:t>
       </w:r>
     </w:p>
     <w:p>
@@ -12055,7 +12073,43 @@
           <w:i w:val="0"/>
           <w:sz w:val="22"/>
         </w:rPr>
-        <w:t>Pilih muka ATAS → Part Design → Thickness, Thickness diikat ekspresi =Jejak.t_dinding, Mode Skin, arah ke dalam. Baca volume dan massa baru; bandingkan dengan Persamaan (5).</w:t>
+        <w:t xml:space="preserve">Klik muka ATAS → Part Design → Dress-Up Features → </w:t>
+      </w:r>
+      <w:r>
+        <w:rPr>
+          <w:rFonts w:ascii="Arial" w:hAnsi="Arial" w:eastAsia="Arial" w:cs="Arial"/>
+          <w:b/>
+          <w:i w:val="0"/>
+          <w:sz w:val="22"/>
+        </w:rPr>
+        <w:t>Thickness</w:t>
+      </w:r>
+      <w:r>
+        <w:rPr>
+          <w:rFonts w:ascii="Arial" w:hAnsi="Arial" w:eastAsia="Arial" w:cs="Arial"/>
+          <w:b w:val="0"/>
+          <w:i w:val="0"/>
+          <w:sz w:val="22"/>
+        </w:rPr>
+        <w:t xml:space="preserve">. Pada kotak Thickness ketik = lalu Jejak.t_dinding (Expression Editor); Mode Skin dan </w:t>
+      </w:r>
+      <w:r>
+        <w:rPr>
+          <w:rFonts w:ascii="Arial" w:hAnsi="Arial" w:eastAsia="Arial" w:cs="Arial"/>
+          <w:b w:val="0"/>
+          <w:i/>
+          <w:sz w:val="22"/>
+        </w:rPr>
+        <w:t>Make thickness inwards</w:t>
+      </w:r>
+      <w:r>
+        <w:rPr>
+          <w:rFonts w:ascii="Arial" w:hAnsi="Arial" w:eastAsia="Arial" w:cs="Arial"/>
+          <w:b w:val="0"/>
+          <w:i w:val="0"/>
+          <w:sz w:val="22"/>
+        </w:rPr>
+        <w:t xml:space="preserve"> tercentang → OK. Konsol: volume 298.500 mm³, massa 2.343,2 g, hemat 80,6 %; bandingkan dengan Persamaan (5).</w:t>
       </w:r>
     </w:p>
     <w:p>
@@ -12088,7 +12142,7 @@
           <w:i w:val="0"/>
           <w:sz w:val="22"/>
         </w:rPr>
-        <w:t>Ubah t_dinding menjadi 8, 6, 5, 4, lalu 3 mm dan catat massanya tiap kali. Perhatikan kapan penghematan mulai melandai dan kapan Thickness mulai gagal.</w:t>
+        <w:t>Tab Jejak: B3 = 8 → Refresh (Ctrl+R) → di konsol klik, Ctrl+End, panah atas, Enter (perintah massa dipanggil ulang). Ulangi untuk 6, 5, 4, 3 mm: massa 3.593,2 · 2.772,5 · 2.343,2 · 1.901,1 · 1.445,9 g, lalu kembalikan ke 5. Perhatikan kapan penghematan mulai melandai dan kapan Thickness mulai gagal.</w:t>
       </w:r>
     </w:p>
     <w:p>
@@ -12121,7 +12175,7 @@
           <w:i w:val="0"/>
           <w:sz w:val="22"/>
         </w:rPr>
-        <w:t>Tambahkan Spreadsheet kedua bernama Neraca (bukan di Jejak, karena Jejak sudah dibaca Thickness) berisi V_body = =Body.Shape.Volume dan co2 = =Jejak.f_st * Jejak.rho_st * V_body. Ubah satu dimensi sketsa dan pastikan angka jejak ikut berubah tanpa mengetik ulang apa pun.</w:t>
+        <w:t>Spreadsheet kedua Neraca (bukan di Jejak, karena Jejak sudah dibaca Thickness): A1 V_body, B1 =Body.Shape.Volume (alias V_body); A2 co2, B2 =Jejak.f_st * Jejak.rho_st * V_body (alias co2) = 298.500 mm³ dan 4,69 kg CO₂. Ubah satu dimensi: pilih Pad → Data → Length 90 → Refresh: Neraca menjadi 325.500 mm³ dan 5,11 kg tanpa mengetik ulang; kembalikan ke 80.</w:t>
       </w:r>
     </w:p>
     <w:p>
@@ -12154,7 +12208,26 @@
           <w:i w:val="0"/>
           <w:sz w:val="22"/>
         </w:rPr>
-        <w:t>Duplikat baris tabel untuk aluminium: tinggi penampang disesuaikan agar kekakuan sama (Persamaan 2), ρ dan f diganti. Bandingkan massa dan jejaknya — perhatikan bahwa massa turun tetapi jejak dapat naik.</w:t>
+        <w:t>Jejak: rho_al 2.7e-6, f_al 12, t_al =t_dinding * (210000 / 70000) ^ (1 / 3) = 7,21 mm (kekakuan dinding sama, Persamaan 2), beri alias. Neraca: m_st =Jejak.rho_st * V_body = 2,34 kg; m_al = ρ</w:t>
+      </w:r>
+      <w:r>
+        <w:rPr>
+          <w:rFonts w:ascii="Arial" w:hAnsi="Arial" w:eastAsia="Arial" w:cs="Arial"/>
+          <w:b w:val="0"/>
+          <w:i w:val="0"/>
+          <w:sz w:val="22"/>
+          <w:vertAlign w:val="subscript"/>
+        </w:rPr>
+        <w:t>al</w:t>
+      </w:r>
+      <w:r>
+        <w:rPr>
+          <w:rFonts w:ascii="Arial" w:hAnsi="Arial" w:eastAsia="Arial" w:cs="Arial"/>
+          <w:b w:val="0"/>
+          <w:i w:val="0"/>
+          <w:sz w:val="22"/>
+        </w:rPr>
+        <w:t xml:space="preserve"> × volume cangkang setebal t_al = 1,13 kg; co2_al =Jejak.f_al * m_al = 13,52 kg CO₂. Massa turun 52 %, tetapi jejak naik 188 %.</w:t>
       </w:r>
     </w:p>
     <w:p>
@@ -12187,7 +12260,7 @@
           <w:i w:val="0"/>
           <w:sz w:val="22"/>
         </w:rPr>
-        <w:t>Tulis kesimpulan satu paragraf pada sel catatan Spreadsheet Neraca: alternatif terpilih, penghematan massa, penghematan jejak, dan batas yang dijaga. Ctrl+S → Latihan13_NIM.FCStd.</w:t>
+        <w:t>Neraca: klik A7, Shift+klik H7 → Spreadsheet → Merge Cells (teks sel tidak meluap ke sel sebelah), lalu tulis kesimpulan: alternatif terpilih, penghematan massa, jejak, dan batas yang dijaga. Tab 3D, Ctrl+S → Latihan13_NIM.FCStd.</w:t>
       </w:r>
     </w:p>
     <w:p>
@@ -12276,6 +12349,183 @@
                 <w:sz w:val="18"/>
               </w:rPr>
               <w:t>Perbaikan</w:t>
+            </w:r>
+          </w:p>
+        </w:tc>
+      </w:tr>
+      <w:tr>
+        <w:tc>
+          <w:tcPr>
+            <w:tcW w:type="dxa" w:w="2929"/>
+          </w:tcPr>
+          <w:p>
+            <w:pPr>
+              <w:spacing w:after="0"/>
+            </w:pPr>
+            <w:r>
+              <w:rPr>
+                <w:rFonts w:ascii="Arial" w:hAnsi="Arial" w:eastAsia="Arial" w:cs="Arial"/>
+                <w:b w:val="0"/>
+                <w:i w:val="0"/>
+                <w:sz w:val="18"/>
+              </w:rPr>
+              <w:t>Massa di konsol tidak berubah setelah t_dinding diubah</w:t>
+            </w:r>
+          </w:p>
+        </w:tc>
+        <w:tc>
+          <w:tcPr>
+            <w:tcW w:type="dxa" w:w="2929"/>
+          </w:tcPr>
+          <w:p>
+            <w:pPr>
+              <w:spacing w:after="0"/>
+            </w:pPr>
+            <w:r>
+              <w:rPr>
+                <w:rFonts w:ascii="Arial" w:hAnsi="Arial" w:eastAsia="Arial" w:cs="Arial"/>
+                <w:b w:val="0"/>
+                <w:i w:val="0"/>
+                <w:sz w:val="18"/>
+              </w:rPr>
+              <w:t>Dokumen belum di-recompute setelah sel diganti</w:t>
+            </w:r>
+          </w:p>
+        </w:tc>
+        <w:tc>
+          <w:tcPr>
+            <w:tcW w:type="dxa" w:w="2929"/>
+          </w:tcPr>
+          <w:p>
+            <w:pPr>
+              <w:spacing w:after="0"/>
+            </w:pPr>
+            <w:r>
+              <w:rPr>
+                <w:rFonts w:ascii="Arial" w:hAnsi="Arial" w:eastAsia="Arial" w:cs="Arial"/>
+                <w:b w:val="0"/>
+                <w:i w:val="0"/>
+                <w:sz w:val="18"/>
+              </w:rPr>
+              <w:t>Klik Refresh (Ctrl+R), lalu baca ulang massa</w:t>
+            </w:r>
+          </w:p>
+        </w:tc>
+      </w:tr>
+      <w:tr>
+        <w:tc>
+          <w:tcPr>
+            <w:tcW w:type="dxa" w:w="2929"/>
+          </w:tcPr>
+          <w:p>
+            <w:pPr>
+              <w:spacing w:after="0"/>
+            </w:pPr>
+            <w:r>
+              <w:rPr>
+                <w:rFonts w:ascii="Arial" w:hAnsi="Arial" w:eastAsia="Arial" w:cs="Arial"/>
+                <w:b w:val="0"/>
+                <w:i w:val="0"/>
+                <w:sz w:val="18"/>
+              </w:rPr>
+              <w:t>Panah atas di konsol tidak memanggil perintah sebelumnya</w:t>
+            </w:r>
+          </w:p>
+        </w:tc>
+        <w:tc>
+          <w:tcPr>
+            <w:tcW w:type="dxa" w:w="2929"/>
+          </w:tcPr>
+          <w:p>
+            <w:pPr>
+              <w:spacing w:after="0"/>
+            </w:pPr>
+            <w:r>
+              <w:rPr>
+                <w:rFonts w:ascii="Arial" w:hAnsi="Arial" w:eastAsia="Arial" w:cs="Arial"/>
+                <w:b w:val="0"/>
+                <w:i w:val="0"/>
+                <w:sz w:val="18"/>
+              </w:rPr>
+              <w:t>Kursor berada di area keluaran konsol, bukan di baris prompt</w:t>
+            </w:r>
+          </w:p>
+        </w:tc>
+        <w:tc>
+          <w:tcPr>
+            <w:tcW w:type="dxa" w:w="2929"/>
+          </w:tcPr>
+          <w:p>
+            <w:pPr>
+              <w:spacing w:after="0"/>
+            </w:pPr>
+            <w:r>
+              <w:rPr>
+                <w:rFonts w:ascii="Arial" w:hAnsi="Arial" w:eastAsia="Arial" w:cs="Arial"/>
+                <w:b w:val="0"/>
+                <w:i w:val="0"/>
+                <w:sz w:val="18"/>
+              </w:rPr>
+              <w:t>Klik konsol, Ctrl+End, lalu panah atas</w:t>
+            </w:r>
+          </w:p>
+        </w:tc>
+      </w:tr>
+      <w:tr>
+        <w:tc>
+          <w:tcPr>
+            <w:tcW w:type="dxa" w:w="2929"/>
+          </w:tcPr>
+          <w:p>
+            <w:pPr>
+              <w:spacing w:after="0"/>
+            </w:pPr>
+            <w:r>
+              <w:rPr>
+                <w:rFonts w:ascii="Arial" w:hAnsi="Arial" w:eastAsia="Arial" w:cs="Arial"/>
+                <w:b w:val="0"/>
+                <w:i w:val="0"/>
+                <w:sz w:val="18"/>
+              </w:rPr>
+              <w:t>Catatan di sel terpotong menjadi “Terpilih: …”</w:t>
+            </w:r>
+          </w:p>
+        </w:tc>
+        <w:tc>
+          <w:tcPr>
+            <w:tcW w:type="dxa" w:w="2929"/>
+          </w:tcPr>
+          <w:p>
+            <w:pPr>
+              <w:spacing w:after="0"/>
+            </w:pPr>
+            <w:r>
+              <w:rPr>
+                <w:rFonts w:ascii="Arial" w:hAnsi="Arial" w:eastAsia="Arial" w:cs="Arial"/>
+                <w:b w:val="0"/>
+                <w:i w:val="0"/>
+                <w:sz w:val="18"/>
+              </w:rPr>
+              <w:t>Teks sel Spreadsheet tidak meluap ke sel sebelah</w:t>
+            </w:r>
+          </w:p>
+        </w:tc>
+        <w:tc>
+          <w:tcPr>
+            <w:tcW w:type="dxa" w:w="2929"/>
+          </w:tcPr>
+          <w:p>
+            <w:pPr>
+              <w:spacing w:after="0"/>
+            </w:pPr>
+            <w:r>
+              <w:rPr>
+                <w:rFonts w:ascii="Arial" w:hAnsi="Arial" w:eastAsia="Arial" w:cs="Arial"/>
+                <w:b w:val="0"/>
+                <w:i w:val="0"/>
+                <w:sz w:val="18"/>
+              </w:rPr>
+              <w:t>Gabungkan sel (Spreadsheet → Merge Cells) sebelum mengetik</w:t>
             </w:r>
           </w:p>
         </w:tc>

</xml_diff>